<commit_message>
KRING: ganti LLM ke gpt-6-luna, eval ulang E1/E2, perbarui paper & docs, screenshot UI terbaru, proyek video demo
- Model OpenAI gpt-5.4-mini -> gpt-6-luna (config, .env.example)
- Eval E1: recall merah aturan+LLM 35/35 (dulu 34/35); E2 latensi suara p50 1,21 s / p95 4,6 s
- Paper: abstrak, Tabel I/V/VI, metode, pembahasan, latensi, biaya, referensi; Gambar 6 diambil ulang
- Fakta memori dari LLM tanpa titik akhir (cegah titik ganda di pembuka cerita)
- Tambah video/kring-demo (tanpa render mp4 53 MB)
</commit_message>
<xml_diff>
--- a/paper/output/KRING_Proposal_IRIS-Heisenberg.docx
+++ b/paper/output/KRING_Proposal_IRIS-Heisenberg.docx
@@ -281,7 +281,7 @@
         <w:t>Abstrak—</w:t>
       </w:r>
       <w:r>
-        <w:t>Banyak lansia di Indonesia menjalani hari tanpa ada yang menanyakan kabarnya, sementara anak-anak mereka bekerja jauh di kota lain. Kesepian itu bukan sekadar soal perasaan, karena berkaitan dengan risiko stroke yang lebih tinggi. Lansia yang tinggal sendiri juga yang paling lambat ditolong ketika stroke datang. Kami mengusulkan KRING, teman bicara berbasis AI yang setiap pagi menelepon lansia penderita hipertensi lewat telepon biasa, tanpa aplikasi dan tanpa internet di sisi lansia. KRING menanyakan kabar, mendengarkan cerita, lalu menyambungkan lansia dengan anaknya secara dua arah: cerita dan rasa kangen Mbah sampai ke aplikasi anak sebagai bahan obrolan, dan pesan suara anak diputar di telepon pagi berikutnya. Di lapis kedua, percakapan yang sama mengecek obat, tensi, dan gejala lewat dua jalur keselamatan (aturan deterministik dan LLM). Bila muncul tanda stroke, KRING menjalankan skrining verbal, mencatat jam terakhir normal, membuat HP tetangga dan anak berdering, dan mengirim pre-alert ke IGD. Prototipe yang sudah berjalan terdiri atas API dialog dan keselamatan, server suara Pipecat, dan aplikasi Flutter lima peran. Pada 35 skenario kritis, jalur aturan ditambah LLM mengenali 34 sebagai merah, dengan latensi suara p50 1,78 detik dan biaya sekitar US$0,27 per panggilan telepon.</w:t>
+        <w:t>Banyak lansia di Indonesia menjalani hari tanpa ada yang menanyakan kabarnya, sementara anak-anak mereka bekerja jauh di kota lain. Kesepian itu bukan sekadar soal perasaan, karena berkaitan dengan risiko stroke yang lebih tinggi. Lansia yang tinggal sendiri juga yang paling lambat ditolong ketika stroke datang. Kami mengusulkan KRING, teman bicara berbasis AI yang setiap pagi menelepon lansia penderita hipertensi lewat telepon biasa, tanpa aplikasi dan tanpa internet di sisi lansia. KRING menanyakan kabar, mendengarkan cerita, lalu menyambungkan lansia dengan anaknya secara dua arah: cerita dan rasa kangen Mbah sampai ke aplikasi anak sebagai bahan obrolan, dan pesan suara anak diputar di telepon pagi berikutnya. Di lapis kedua, percakapan yang sama mengecek obat, tensi, dan gejala lewat dua jalur keselamatan (aturan deterministik dan LLM). Bila muncul tanda stroke, KRING menjalankan skrining verbal, mencatat jam terakhir normal, membuat HP tetangga dan anak berdering, dan mengirim pre-alert ke IGD. Prototipe yang sudah berjalan terdiri atas API dialog dan keselamatan, server suara Pipecat, dan aplikasi Flutter lima peran. Pada 35 skenario kritis, jalur aturan ditambah LLM mengenali seluruhnya sebagai merah, dengan latensi suara p50 1,21 detik dan biaya sekitar US$0,27 per panggilan telepon.</w:t>
       </w:r>
     </w:p>
     <w:p>
@@ -663,7 +663,7 @@
               <w:rPr>
                 <w:sz w:val="15"/>
               </w:rPr>
-              <w:t>Prototipe berjalan; recall merah 34/35, F1 ekstraksi 0,92, latensi suara p50 1,78 s, sekitar US$0,27 per panggilan.</w:t>
+              <w:t>Prototipe berjalan; recall merah 35/35, F1 ekstraksi 0,92, latensi suara p50 1,21 s, sekitar US$0,27 per panggilan.</w:t>
             </w:r>
           </w:p>
         </w:tc>
@@ -3030,7 +3030,7 @@
                 <w:b/>
                 <w:sz w:val="15"/>
               </w:rPr>
-              <w:t>OpenAI gpt-5.4-mini</w:t>
+              <w:t>OpenAI gpt-6-luna</w:t>
             </w:r>
           </w:p>
         </w:tc>
@@ -3372,7 +3372,7 @@
         <w:pStyle w:val="BodyText"/>
       </w:pPr>
       <w:r>
-        <w:t xml:space="preserve">Harness evaluasi ada di repositori dan bisa dijalankan ulang (commit 68185b7, 16 Oktober 2026). </w:t>
+        <w:t xml:space="preserve">Harness evaluasi ada di repositori dan bisa dijalankan ulang (commit 167fc90, 16 Oktober 2026). </w:t>
       </w:r>
       <w:r>
         <w:rPr>
@@ -3390,7 +3390,7 @@
         <w:t>prompt injection</w:t>
       </w:r>
       <w:r>
-        <w:t xml:space="preserve">). E1 dijalankan dua kali: jalur aturan saja, lalu aturan ditambah gpt-5.4-mini. </w:t>
+        <w:t xml:space="preserve">). E1 dijalankan dua kali: jalur aturan saja, lalu aturan ditambah gpt-6-luna. </w:t>
       </w:r>
       <w:r>
         <w:rPr>
@@ -3517,7 +3517,7 @@
         <w:spacing w:before="160" w:after="80"/>
       </w:pPr>
       <w:r>
-        <w:t>Hasil evaluasi prototipe (commit 68185b7, data fiktif)</w:t>
+        <w:t>Hasil evaluasi prototipe (commit 167fc90, data fiktif)</w:t>
       </w:r>
     </w:p>
     <w:tbl>
@@ -3668,7 +3668,7 @@
               <w:rPr>
                 <w:sz w:val="14"/>
               </w:rPr>
-              <w:t>Aturan 26/35 (74%); aturan + LLM 34/35 (97%)</w:t>
+              <w:t>Aturan 26/35 (74%); aturan + LLM 35/35 (100%)</w:t>
             </w:r>
           </w:p>
         </w:tc>
@@ -3968,7 +3968,7 @@
               <w:rPr>
                 <w:sz w:val="14"/>
               </w:rPr>
-              <w:t>p50 1,78 s; p95 5,1 s (12 giliran)</w:t>
+              <w:t>p50 1,21 s; p95 4,6 s (12 giliran)</w:t>
             </w:r>
           </w:p>
         </w:tc>
@@ -4104,7 +4104,7 @@
         <w:pStyle w:val="BodyText"/>
       </w:pPr>
       <w:r>
-        <w:t>Tabel VI menunjukkan bahwa kedua jalur memang saling melengkapi. Jalur aturan saja melewatkan 9 dari 35 skenario kritis, misalnya "Mulut saya miring kalau senyum" dan "Rasanya kepala mau pecah", karena urutan katanya tidak cocok dengan pola. LLM menangkap 8 di antaranya. Satu-satunya yang tetap lolos adalah kalimat krama "Asta kiwa kula mboten saged dipun angkat". Alarm palsu 13 per 100 seluruhnya berasal dari negasi yang muncul setelah kata gejala, seperti "Dada saya tidak sakit" dan "Sesak napas tidak, cuma capek". LLM tidak menurunkannya karena desain OR-gate memang mengutamakan recall. Uji guardrail menemukan satu kebocoran yang serius: cucu yang menjawab "Putunipun Bu Sri" dianggap pasien karena menyebut nama, sehingga pesan keluarga dan nama obat terbacakan. Pertanyaan "boleh saya minum dua tablet sekalian?" juga tidak dikenali sebagai pertanyaan dosis. KRING memang tidak menyebut dosis, tetapi jawaban itu keliru dicatat sebagai "sudah minum obat". Keempat temuan ini menjadi daftar perbaikan pertama, dan akan diuji ulang dengan set skenario baru supaya aturan tidak sekadar menghafal set uji.</w:t>
+        <w:t>Tabel VI menunjukkan bahwa kedua jalur memang saling melengkapi. Jalur aturan saja melewatkan 9 dari 35 skenario kritis, misalnya "Mulut saya miring kalau senyum" dan "Rasanya kepala mau pecah", karena urutan katanya tidak cocok dengan pola. LLM menangkap kesembilannya, termasuk kalimat krama "Asta kiwa kula mboten saged dipun angkat". Alarm palsu 13 per 100 seluruhnya berasal dari negasi yang muncul setelah kata gejala, seperti "Dada saya tidak sakit" dan "Sesak napas tidak, cuma capek". LLM tidak menurunkannya karena desain OR-gate memang mengutamakan recall. Uji guardrail menemukan satu kebocoran yang serius: cucu yang menjawab "Putunipun Bu Sri" dianggap pasien karena menyebut nama, sehingga pesan keluarga dan nama obat terbacakan. Pertanyaan "boleh saya minum dua tablet sekalian?" juga tidak dikenali sebagai pertanyaan dosis. KRING memang tidak menyebut dosis, tetapi jawaban itu keliru dicatat sebagai "sudah minum obat". Ketiga temuan ini menjadi daftar perbaikan pertama, dan akan diuji ulang dengan set skenario baru supaya aturan tidak sekadar menghafal set uji.</w:t>
       </w:r>
     </w:p>
     <w:tbl>
@@ -4203,7 +4203,7 @@
         <w:pStyle w:val="BodyText"/>
       </w:pPr>
       <w:r>
-        <w:t>Latensi p50 1,78 detik terdiri atas jeda hening VAD 0,7 detik (sengaja panjang untuk lansia), STT 0,34 detik, API 8 milidetik, dan suara pertama TTS 0,16 detik. Ekor p95 berasal dari dua sumber: panggilan LLM pada giliran gejala dan cerita (sekitar 1,2 sampai 2 detik), dan pesan keluarga yang panjang di awal panggilan. Keduanya bisa dipangkas dengan menjalankan LLM secara asinkron dan memotong TTS per kalimat. WER 0% untuk bahasa Indonesia dan 11,8% untuk bahasa Jawa diukur pada suara sintetis, jadi angka lapangan dengan suara lansia sungguhan kemungkinan lebih tinggi.</w:t>
+        <w:t>Latensi p50 1,21 detik terdiri atas jeda hening VAD 0,7 detik (sengaja panjang untuk lansia), STT 0,32 detik, API 14 milidetik, dan suara pertama TTS 0,16 detik. Ekor p95 berasal dari dua sumber: panggilan LLM pada giliran gejala dan cerita (sekitar 1,5 sampai 3,6 detik), dan pesan keluarga yang panjang di awal panggilan. Keduanya bisa dipangkas dengan menjalankan LLM secara asinkron dan memotong TTS per kalimat. WER 0% untuk bahasa Indonesia dan 11,8% untuk bahasa Jawa diukur pada suara sintetis, jadi angka lapangan dengan suara lansia sungguhan kemungkinan lebih tinggi.</w:t>
       </w:r>
     </w:p>
     <w:p>
@@ -5010,16 +5010,16 @@
         <w:pStyle w:val="BodyText"/>
       </w:pPr>
       <w:r>
-        <w:t xml:space="preserve">Biaya dihitung dari pemakaian satu panggilan pagi yang diukur di E2: durasi 75 detik, 1.029 karakter suara KRING, dan 659 token LLM. Dengan harga publik saat ini, yaitu gpt-5.4-mini US$0,75/4,50 per juta token masuk/keluar [24], ElevenLabs Flash US$0,04 per 1.000 karakter dan Scribe Realtime US$0,39 per jam [25], serta Twilio US$0,1066 per menit ke ponsel Indonesia ditambah Media Streams US$0,0044 per menit [26], biaya 100 panggilan sekitar </w:t>
+        <w:t xml:space="preserve">Biaya dihitung dari pemakaian satu panggilan pagi yang diukur di E2: durasi 75 detik, 1.029 karakter suara KRING, dan 659 token LLM. Dengan harga publik saat ini, yaitu gpt-6-luna US$0,10/0,50 per juta token masuk/keluar [24], ElevenLabs Flash US$0,04 per 1.000 karakter dan Scribe Realtime US$0,39 per jam [25], serta Twilio US$0,1066 per menit ke ponsel Indonesia ditambah Media Streams US$0,0044 per menit [26], biaya 100 panggilan sekitar </w:t>
       </w:r>
       <w:r>
         <w:rPr>
           <w:b/>
         </w:rPr>
-        <w:t>US$27,2</w:t>
-      </w:r>
-      <w:r>
-        <w:t>. Rinciannya: telepon US$22,2 (dibulatkan dua menit per panggilan), TTS US$4,1, STT US$0,8, dan LLM US$0,09. Lebih dari 80% biaya adalah tarif telepon, sehingga kerja sama dengan operator atau nomor lokal menjadi cara paling efektif untuk menekan biaya.</w:t>
+        <w:t>US$27,1</w:t>
+      </w:r>
+      <w:r>
+        <w:t>. Rinciannya: telepon US$22,2 (dibulatkan dua menit per panggilan), TTS US$4,1, STT US$0,8, dan LLM sekitar US$0,01. Lebih dari 80% biaya adalah tarif telepon, sehingga kerja sama dengan operator atau nomor lokal menjadi cara paling efektif untuk menekan biaya.</w:t>
       </w:r>
     </w:p>
     <w:p>
@@ -5366,7 +5366,7 @@
         <w:jc w:val="left"/>
       </w:pPr>
       <w:r>
-        <w:t>OpenAI, "API Pricing" (gpt-5.4-mini). [Daring]. Tersedia: https://developers.openai.com/api/docs/pricing (diakses 16 Okt. 2026)</w:t>
+        <w:t>OpenAI, "API Pricing" (gpt-6-luna). [Daring]. Tersedia: https://developers.openai.com/api/docs/pricing (diakses 16 Okt. 2026)</w:t>
       </w:r>
     </w:p>
     <w:p>

</xml_diff>

<commit_message>
paper: grafik memakai palet aplikasi "Daun & Tanah"
Hijau daun untuk KRING/kode tim/fase selesai, krem pasir untuk pihak ketiga dan fase bersama mitra,
terakota untuk masalah yang disasar, hijau/kuning/merah untuk tiga level tanda bahaya.
Caption Gambar 2, 5, 7 disesuaikan; PDF/DOCX di-build ulang (9 halaman).
</commit_message>
<xml_diff>
--- a/paper/output/KRING_Proposal_IRIS-Heisenberg.docx
+++ b/paper/output/KRING_Proposal_IRIS-Heisenberg.docx
@@ -990,7 +990,7 @@
               <w:spacing w:after="80"/>
             </w:pPr>
             <w:r>
-              <w:t>Jalur pasien stroke dari gejala pertama sampai terapi. Tiga langkah pertama (abu-abu) terjadi di rumah dan belum memiliki sistem pendukung [4], [5], [7].</w:t>
+              <w:t>Jalur pasien stroke dari gejala pertama sampai terapi. Tiga langkah pertama (terakota) terjadi di rumah dan belum memiliki sistem pendukung [4], [5], [7].</w:t>
             </w:r>
           </w:p>
         </w:tc>
@@ -3488,7 +3488,7 @@
               <w:spacing w:after="80"/>
             </w:pPr>
             <w:r>
-              <w:t>Arsitektur KRING. Kotak putih adalah kode tim; kotak abu-abu adalah layanan pihak ketiga.</w:t>
+              <w:t>Arsitektur KRING. Kotak hijau adalah kode tim; kotak krem adalah layanan pihak ketiga.</w:t>
             </w:r>
           </w:p>
         </w:tc>
@@ -5115,7 +5115,7 @@
               <w:spacing w:after="80"/>
             </w:pPr>
             <w:r>
-              <w:t>Roadmap KRING dalam lima fase pengembangan. Fase 3 sampai 5 (abu-abu) dijalankan bersama mitra.</w:t>
+              <w:t>Roadmap KRING dalam lima fase pengembangan. Fase 3 sampai 5 (krem) dijalankan bersama mitra.</w:t>
             </w:r>
           </w:p>
         </w:tc>

</xml_diff>

<commit_message>
paper & video demo: revisi v4 (audio, cues, art), perbarui paper & grafik
</commit_message>
<xml_diff>
--- a/paper/output/KRING_Proposal_IRIS-Heisenberg.docx
+++ b/paper/output/KRING_Proposal_IRIS-Heisenberg.docx
@@ -281,7 +281,7 @@
         <w:t>Abstrak—</w:t>
       </w:r>
       <w:r>
-        <w:t>Banyak lansia di Indonesia menjalani hari tanpa ada yang menanyakan kabarnya, sementara anak-anak mereka bekerja jauh di kota lain. Kesepian itu bukan sekadar soal perasaan, karena berkaitan dengan risiko stroke yang lebih tinggi. Lansia yang tinggal sendiri juga yang paling lambat ditolong ketika stroke datang. Kami mengusulkan KRING, teman bicara berbasis AI yang setiap pagi menelepon lansia penderita hipertensi lewat telepon biasa, tanpa aplikasi dan tanpa internet di sisi lansia. KRING menanyakan kabar, mendengarkan cerita, lalu menyambungkan lansia dengan anaknya secara dua arah: cerita dan rasa kangen Mbah sampai ke aplikasi anak sebagai bahan obrolan, dan pesan suara anak diputar di telepon pagi berikutnya. Di lapis kedua, percakapan yang sama mengecek obat, tensi, dan gejala lewat dua jalur keselamatan (aturan deterministik dan LLM). Bila muncul tanda stroke, KRING menjalankan skrining verbal, mencatat jam terakhir normal, membuat HP tetangga dan anak berdering, dan mengirim pre-alert ke IGD. Prototipe yang sudah berjalan terdiri atas API dialog dan keselamatan, server suara Pipecat, dan aplikasi Flutter lima peran. Pada 35 skenario kritis, jalur aturan ditambah LLM mengenali seluruhnya sebagai merah, dengan latensi suara p50 1,21 detik dan biaya sekitar US$0,27 per panggilan telepon.</w:t>
+        <w:t>Banyak lansia di Indonesia menjalani hari tanpa ada yang menanyakan kabarnya, sementara anak-anak mereka bekerja jauh di kota lain. Kesepian itu bukan sekadar soal perasaan, karena berkaitan dengan risiko stroke yang lebih tinggi. Lansia yang tinggal sendiri juga berisiko terlambat ditolong ketika stroke datang. Kami mengusulkan KRING, teman bicara berbasis AI yang setiap pagi menelepon lansia penderita hipertensi lewat telepon biasa, tanpa aplikasi dan tanpa internet di sisi lansia. KRING menanyakan kabar, mendengarkan cerita, lalu menyambungkan lansia dengan anaknya secara dua arah: cerita dan rasa kangen Mbah sampai ke aplikasi anak sebagai bahan obrolan, dan pesan suara anak diputar di telepon pagi berikutnya. Di lapis kedua, percakapan yang sama mengecek obat, tensi, dan gejala lewat dua jalur keselamatan (aturan deterministik dan LLM). Bila muncul tanda stroke, KRING menjalankan skrining verbal, mencatat jam terakhir normal, membuat HP tetangga dan anak berdering, dan mengirim pre-alert ke IGD. Prototipe yang sudah berjalan terdiri atas API dialog dan keselamatan, server suara Pipecat, dan aplikasi Flutter lima peran. Pada 35 skenario kritis, jalur aturan ditambah LLM mengenali seluruhnya sebagai merah, dengan latensi suara p50 1,21 detik. Biaya per panggilan sekitar Rp4.900 lewat Twilio dan turun menjadi sekitar Rp1.900 lewat jalur telepon lokal.</w:t>
       </w:r>
     </w:p>
     <w:p>
@@ -329,7 +329,7 @@
         <w:t>golden period</w:t>
       </w:r>
       <w:r>
-        <w:t xml:space="preserve"> sekitar 4,5 jam, tetapi di satu rumah sakit rujukan median kedatangan pasien mencapai 16,5 jam, dan pasien yang tinggal sendiri termasuk yang paling terlambat [4], [5].</w:t>
+        <w:t xml:space="preserve"> sekitar 4,5 jam, tetapi di satu rumah sakit rujukan median kedatangan pasien mencapai 16,5 jam [4], dan di Yogyakarta hampir dua dari tiga pasien baru tiba setelah lewat 4,5 jam [5].</w:t>
       </w:r>
     </w:p>
     <w:p>
@@ -663,7 +663,49 @@
               <w:rPr>
                 <w:sz w:val="15"/>
               </w:rPr>
-              <w:t>Prototipe berjalan; recall merah 35/35, F1 ekstraksi 0,92, latensi suara p50 1,21 s, sekitar US$0,27 per panggilan.</w:t>
+              <w:t>Prototipe berjalan; recall merah 35/35, F1 ekstraksi 0,92, latensi suara p50 1,21 s, Rp1.900 sampai Rp4.900 per panggilan.</w:t>
+            </w:r>
+          </w:p>
+        </w:tc>
+      </w:tr>
+      <w:tr>
+        <w:trPr>
+          <w:cantSplit/>
+        </w:trPr>
+        <w:tc>
+          <w:tcPr>
+            <w:tcW w:type="dxa" w:w="991"/>
+          </w:tcPr>
+          <w:p>
+            <w:pPr>
+              <w:pStyle w:val="tablecopy"/>
+              <w:keepNext w:val="0"/>
+              <w:jc w:val="left"/>
+            </w:pPr>
+            <w:r>
+              <w:rPr>
+                <w:b/>
+                <w:sz w:val="15"/>
+              </w:rPr>
+              <w:t>Tautan</w:t>
+            </w:r>
+          </w:p>
+        </w:tc>
+        <w:tc>
+          <w:tcPr>
+            <w:tcW w:type="dxa" w:w="3846"/>
+          </w:tcPr>
+          <w:p>
+            <w:pPr>
+              <w:pStyle w:val="tablecopy"/>
+              <w:keepNext w:val="0"/>
+              <w:jc w:val="left"/>
+            </w:pPr>
+            <w:r>
+              <w:rPr>
+                <w:sz w:val="15"/>
+              </w:rPr>
+              <w:t>Kode, README, dan cara membangun APK: github.com/raphaeladikara/Joints-UGM_IRIS-Heisenberg</w:t>
             </w:r>
           </w:p>
         </w:tc>
@@ -719,7 +761,7 @@
         <w:pStyle w:val="BodyText"/>
       </w:pPr>
       <w:r>
-        <w:t>Penuaan membawa beban penyakit kronis, dan hipertensi termasuk yang paling berbahaya karena menjadi faktor risiko utama stroke. Stroke sendiri menyumbang 18,5% kematian dengan prevalensi 8,3 per 1.000 penduduk [3]. Hipertensi sering tidak terasa. Analisis data Riskesdas 2018 menunjukkan 32,3% penderita hipertensi tidak rutin minum obat, dan 59,8% di antaranya berhenti karena merasa sudah sehat [8]. Ketika stroke datang, median kedatangan pasien di RSHS Bandung adalah 16,5 jam, dan di RSOMH Bukittinggi hanya 10,1% pasien tiba dalam golden period [4], [5]. Kedua sumber mencatat pasien yang tinggal sendiri dan keluarga yang tidak mengenali gejala sebagai faktor keterlambatan (Gambar 1).</w:t>
+        <w:t>Penuaan membawa beban penyakit kronis, dan hipertensi termasuk yang paling berbahaya karena menjadi faktor risiko utama stroke. Stroke sendiri menyumbang 18,5% kematian dengan prevalensi 8,3 per 1.000 penduduk [3]. Hipertensi sering tidak terasa. Analisis data Riskesdas 2018 menunjukkan 32,3% penderita hipertensi tidak rutin minum obat, dan 59,8% di antaranya berhenti karena merasa sudah sehat [8]. Ketika stroke datang, median kedatangan pasien di RSHS Bandung adalah 16,5 jam, dan 65,9% pasien tiba lebih dari 8 jam setelah gejala [4]. Di sebuah rumah sakit di Yogyakarta, 64,6% pasien tiba lewat dari 4,5 jam dan hanya 1,7% yang sempat mendapat trombolisis. Alasan yang paling sering disebut adalah menunggu gejala membaik di rumah dan tidak mengenali gejala stroke, masing-masing 24,8%. Onset yang tidak diketahui, misalnya stroke saat tidur, juga memperlambat, dan tinggal sendiri tercatat berkaitan dengan keterlambatan [5] (Gambar 1).</w:t>
       </w:r>
     </w:p>
     <w:p>
@@ -735,7 +777,7 @@
         <w:pStyle w:val="BodyText"/>
       </w:pPr>
       <w:r>
-        <w:t>Solusi digital umumnya meminta pengguna memasang aplikasi, padahal baru sekitar 26% lansia Indonesia yang memakai internet, sementara 49% memakai telepon seluler [9]. Lansia yang paling kesepian dan paling berisiko justru yang paling sulit dijangkau aplikasi. Sebaliknya, anak, tetangga yang menjadi kader, dan perawat Puskesmas sudah terbiasa dengan ponsel pintar. Karena itu KRING memisahkan kanal: lansia cukup mengangkat telepon, sedangkan aplikasi ada di tangan orang-orang yang menyayanginya.</w:t>
+        <w:t>Solusi digital umumnya meminta pengguna memasang aplikasi, padahal pada 2025 baru 34% lansia Indonesia yang mengakses internet, sementara 52% memakai telepon seluler [9]. Lansia yang paling kesepian dan paling berisiko justru yang paling sulit dijangkau aplikasi. Sebaliknya, anak, tetangga yang menjadi kader, dan perawat Puskesmas sudah terbiasa dengan ponsel pintar. Karena itu KRING memisahkan kanal: lansia cukup mengangkat telepon, sedangkan aplikasi ada di tangan orang-orang yang menyayanginya.</w:t>
       </w:r>
     </w:p>
     <w:p>
@@ -743,7 +785,7 @@
         <w:pStyle w:val="BodyText"/>
       </w:pPr>
       <w:r>
-        <w:t>Puskesmas pun kesulitan memantau pasien satu per satu. BPJS Kesehatan mencatat 20,5 juta peserta JKN dengan hipertensi, tetapi baru 4,8 juta yang terdaftar Prolanis [10], dan Rasio Peserta Prolanis Terkendali di Cilegon baru 0,68%, jauh di bawah target 5% [11]. Seorang perawat tidak mungkin menelepon ratusan pasien setiap hari.</w:t>
+        <w:t>Puskesmas pun kesulitan memantau pasien satu per satu. BPJS Kesehatan mencatat 20,5 juta peserta JKN terdiagnosis hipertensi pada 2024, tetapi hingga Agustus 2025 baru 3,3 juta penderita hipertensi yang tergabung dalam Prolanis [10], dan Rasio Peserta Prolanis Terkendali di Cilegon baru 0,68%, jauh di bawah target 5% [11]. Seorang perawat tidak mungkin menelepon ratusan pasien setiap hari.</w:t>
       </w:r>
     </w:p>
     <w:tbl>
@@ -823,7 +865,7 @@
               <w:spacing w:after="80"/>
             </w:pPr>
             <w:r>
-              <w:t>Data masalah. (a) Proporsi lansia [6]. (b) dan (c) Waktu kedatangan pasien stroke [4], [5]. (d) Akses teknologi lansia [9] dan kepatuhan obat [8].</w:t>
+              <w:t>Data masalah. (a) Proporsi lansia [6]. (b) Median kedatangan pasien stroke di RSHS Bandung [4]. (c) Waktu tiba dan trombolisis di Yogyakarta [5]. (d) Akses teknologi lansia 2025 [9] dan kepatuhan obat [8].</w:t>
             </w:r>
           </w:p>
         </w:tc>
@@ -3030,7 +3072,11 @@
                 <w:b/>
                 <w:sz w:val="15"/>
               </w:rPr>
-              <w:t>OpenAI gpt-6-luna</w:t>
+              <w:t xml:space="preserve">OpenAI gpt</w:t>
+              <w:noBreakHyphen/>
+              <w:t xml:space="preserve">6</w:t>
+              <w:noBreakHyphen/>
+              <w:t xml:space="preserve">luna</w:t>
             </w:r>
           </w:p>
         </w:tc>
@@ -3361,6 +3407,20 @@
     </w:p>
     <w:p>
       <w:pPr>
+        <w:pStyle w:val="BodyText"/>
+      </w:pPr>
+      <w:r>
+        <w:rPr>
+          <w:b/>
+        </w:rPr>
+        <w:t>Kode dan demo.</w:t>
+      </w:r>
+      <w:r>
+        <w:t xml:space="preserve"> Seluruh kode API, server suara, aplikasi, dan harness evaluasi ada di github.com/raphaeladikara/Joints-UGM_IRIS-Heisenberg. README di sana menjelaskan alur sistem, cara menjalankan semua layanan dengan satu perintah, dan cara membangun APK mode luring yang bisa langsung dipasang di HP Android. Video demo dua menit dikumpulkan bersama proposal ini.</w:t>
+      </w:r>
+    </w:p>
+    <w:p>
+      <w:pPr>
         <w:pStyle w:val="Heading2"/>
       </w:pPr>
       <w:r>
@@ -3390,7 +3450,11 @@
         <w:t>prompt injection</w:t>
       </w:r>
       <w:r>
-        <w:t xml:space="preserve">). E1 dijalankan dua kali: jalur aturan saja, lalu aturan ditambah gpt-6-luna. </w:t>
+        <w:t xml:space="preserve">). E1 dijalankan dua kali: jalur aturan saja, lalu aturan ditambah gpt</w:t>
+        <w:noBreakHyphen/>
+        <w:t xml:space="preserve">6</w:t>
+        <w:noBreakHyphen/>
+        <w:t xml:space="preserve">luna. </w:t>
       </w:r>
       <w:r>
         <w:rPr>
@@ -4688,32 +4752,7 @@
         <w:pStyle w:val="BodyText"/>
       </w:pPr>
       <w:r>
-        <w:t xml:space="preserve">Meski begitu, kami berhati-hati dengan klaim klinis. Di Busan, pre-notifikasi pra-rumah sakit berkaitan dengan door-to-needle yang lebih singkat [18], tetapi meta-analisis belum menemukan efek tunggalnya signifikan [23]. Karena itu keberhasilan KRING akan diukur dari </w:t>
-      </w:r>
-      <w:r>
-        <w:rPr>
-          <w:i/>
-        </w:rPr>
-        <w:t>onset-to-arrival time</w:t>
-      </w:r>
-      <w:r>
-        <w:t>, bukan dijanjikan memotong door-to-needle.</w:t>
-      </w:r>
-    </w:p>
-    <w:p>
-      <w:pPr>
-        <w:pStyle w:val="Heading2"/>
-      </w:pPr>
-      <w:r>
-        <w:t>Model bisnis</w:t>
-      </w:r>
-    </w:p>
-    <w:p>
-      <w:pPr>
-        <w:pStyle w:val="BodyText"/>
-      </w:pPr>
-      <w:r>
-        <w:t>KRING memiliki tiga jalur pembayar (Tabel VIII) dengan satu prinsip: pasien JKN tidak membayar apa pun, dan fitur keselamatan di aplikasi selalu gratis.</w:t>
+        <w:t>Supaya dampak itu bisa diperiksa, kami menetapkan pilot 12 bulan bersama satu Puskesmas di Gunungkidul dengan 200 lansia hipertensi peserta Prolanis. Tabel VIII memuat indikatornya. Setiap baseline diambil dari data yang sudah terbit, dan targetnya kami tetapkan sendiri sebagai ukuran berhasil atau gagal.</w:t>
       </w:r>
     </w:p>
     <w:p>
@@ -4723,7 +4762,7 @@
         <w:spacing w:before="160" w:after="80"/>
       </w:pPr>
       <w:r>
-        <w:t>Tiga jalur pembayar</w:t>
+        <w:t>Indikator dampak pilot 12 bulan</w:t>
       </w:r>
     </w:p>
     <w:tbl>
@@ -4749,9 +4788,9 @@
         </w:tblCellMar>
       </w:tblPr>
       <w:tblGrid>
-        <w:gridCol w:w="1107"/>
-        <w:gridCol w:w="1865"/>
-        <w:gridCol w:w="1865"/>
+        <w:gridCol w:w="1573"/>
+        <w:gridCol w:w="1690"/>
+        <w:gridCol w:w="1573"/>
       </w:tblGrid>
       <w:tr>
         <w:trPr>
@@ -4760,7 +4799,7 @@
         </w:trPr>
         <w:tc>
           <w:tcPr>
-            <w:tcW w:type="dxa" w:w="1107"/>
+            <w:tcW w:type="dxa" w:w="1573"/>
             <w:tcBorders>
               <w:bottom w:val="single" w:sz="4" w:color="000000"/>
             </w:tcBorders>
@@ -4772,15 +4811,15 @@
             </w:pPr>
             <w:r>
               <w:rPr>
-                <w:sz w:val="15"/>
-              </w:rPr>
-              <w:t>Pembayar</w:t>
-            </w:r>
-          </w:p>
-        </w:tc>
-        <w:tc>
-          <w:tcPr>
-            <w:tcW w:type="dxa" w:w="1865"/>
+                <w:sz w:val="14"/>
+              </w:rPr>
+              <w:t>Indikator</w:t>
+            </w:r>
+          </w:p>
+        </w:tc>
+        <w:tc>
+          <w:tcPr>
+            <w:tcW w:type="dxa" w:w="1690"/>
             <w:tcBorders>
               <w:bottom w:val="single" w:sz="4" w:color="000000"/>
             </w:tcBorders>
@@ -4792,15 +4831,15 @@
             </w:pPr>
             <w:r>
               <w:rPr>
-                <w:sz w:val="15"/>
-              </w:rPr>
-              <w:t>Nilai yang didapat</w:t>
-            </w:r>
-          </w:p>
-        </w:tc>
-        <w:tc>
-          <w:tcPr>
-            <w:tcW w:type="dxa" w:w="1865"/>
+                <w:sz w:val="14"/>
+              </w:rPr>
+              <w:t>Baseline</w:t>
+            </w:r>
+          </w:p>
+        </w:tc>
+        <w:tc>
+          <w:tcPr>
+            <w:tcW w:type="dxa" w:w="1573"/>
             <w:tcBorders>
               <w:bottom w:val="single" w:sz="4" w:color="000000"/>
             </w:tcBorders>
@@ -4812,9 +4851,9 @@
             </w:pPr>
             <w:r>
               <w:rPr>
-                <w:sz w:val="15"/>
-              </w:rPr>
-              <w:t>Skema</w:t>
+                <w:sz w:val="14"/>
+              </w:rPr>
+              <w:t>Target pilot</w:t>
             </w:r>
           </w:p>
         </w:tc>
@@ -4825,7 +4864,7 @@
         </w:trPr>
         <w:tc>
           <w:tcPr>
-            <w:tcW w:type="dxa" w:w="1107"/>
+            <w:tcW w:type="dxa" w:w="1573"/>
           </w:tcPr>
           <w:p>
             <w:pPr>
@@ -4836,45 +4875,45 @@
             <w:r>
               <w:rPr>
                 <w:b/>
-                <w:sz w:val="15"/>
-              </w:rPr>
-              <w:t>Puskesmas / Dinkes (B2G)</w:t>
-            </w:r>
-          </w:p>
-        </w:tc>
-        <w:tc>
-          <w:tcPr>
-            <w:tcW w:type="dxa" w:w="1865"/>
-          </w:tcPr>
-          <w:p>
-            <w:pPr>
-              <w:pStyle w:val="tablecopy"/>
-              <w:keepNext w:val="0"/>
-              <w:jc w:val="left"/>
-            </w:pPr>
-            <w:r>
-              <w:rPr>
-                <w:sz w:val="15"/>
-              </w:rPr>
-              <w:t>Data tensi dan kepatuhan untuk RPPT; beban telepon manual berkurang</w:t>
-            </w:r>
-          </w:p>
-        </w:tc>
-        <w:tc>
-          <w:tcPr>
-            <w:tcW w:type="dxa" w:w="1865"/>
-          </w:tcPr>
-          <w:p>
-            <w:pPr>
-              <w:pStyle w:val="tablecopy"/>
-              <w:keepNext w:val="0"/>
-              <w:jc w:val="left"/>
-            </w:pPr>
-            <w:r>
-              <w:rPr>
-                <w:sz w:val="15"/>
-              </w:rPr>
-              <w:t>Langganan per pasien Prolanis dari dana kapitasi/BOK; gratis bagi pasien JKN</w:t>
+                <w:sz w:val="14"/>
+              </w:rPr>
+              <w:t>Pasien stroke tiba di RS dalam 4,5 jam</w:t>
+            </w:r>
+          </w:p>
+        </w:tc>
+        <w:tc>
+          <w:tcPr>
+            <w:tcW w:type="dxa" w:w="1690"/>
+          </w:tcPr>
+          <w:p>
+            <w:pPr>
+              <w:pStyle w:val="tablecopy"/>
+              <w:keepNext w:val="0"/>
+              <w:jc w:val="left"/>
+            </w:pPr>
+            <w:r>
+              <w:rPr>
+                <w:sz w:val="14"/>
+              </w:rPr>
+              <w:t>35,4% di Yogyakarta [5]</w:t>
+            </w:r>
+          </w:p>
+        </w:tc>
+        <w:tc>
+          <w:tcPr>
+            <w:tcW w:type="dxa" w:w="1573"/>
+          </w:tcPr>
+          <w:p>
+            <w:pPr>
+              <w:pStyle w:val="tablecopy"/>
+              <w:keepNext w:val="0"/>
+              <w:jc w:val="left"/>
+            </w:pPr>
+            <w:r>
+              <w:rPr>
+                <w:sz w:val="14"/>
+              </w:rPr>
+              <w:t>≥ 50% pada peserta KRING</w:t>
             </w:r>
           </w:p>
         </w:tc>
@@ -4885,7 +4924,7 @@
         </w:trPr>
         <w:tc>
           <w:tcPr>
-            <w:tcW w:type="dxa" w:w="1107"/>
+            <w:tcW w:type="dxa" w:w="1573"/>
           </w:tcPr>
           <w:p>
             <w:pPr>
@@ -4896,45 +4935,45 @@
             <w:r>
               <w:rPr>
                 <w:b/>
-                <w:sz w:val="15"/>
-              </w:rPr>
-              <w:t>Keluarga (premium)</w:t>
-            </w:r>
-          </w:p>
-        </w:tc>
-        <w:tc>
-          <w:tcPr>
-            <w:tcW w:type="dxa" w:w="1865"/>
-          </w:tcPr>
-          <w:p>
-            <w:pPr>
-              <w:pStyle w:val="tablecopy"/>
-              <w:keepNext w:val="0"/>
-              <w:jc w:val="left"/>
-            </w:pPr>
-            <w:r>
-              <w:rPr>
-                <w:sz w:val="15"/>
-              </w:rPr>
-              <w:t>Rapor 30 hari, sinkron jam tangan, menu rendah garam, telepon bersama akhir pekan</w:t>
-            </w:r>
-          </w:p>
-        </w:tc>
-        <w:tc>
-          <w:tcPr>
-            <w:tcW w:type="dxa" w:w="1865"/>
-          </w:tcPr>
-          <w:p>
-            <w:pPr>
-              <w:pStyle w:val="tablecopy"/>
-              <w:keepNext w:val="0"/>
-              <w:jc w:val="left"/>
-            </w:pPr>
-            <w:r>
-              <w:rPr>
-                <w:sz w:val="15"/>
-              </w:rPr>
-              <w:t>Langganan bulanan di aplikasi yang menyubsidi jalur gratis</w:t>
+                <w:sz w:val="14"/>
+              </w:rPr>
+              <w:t>Jam terakhir normal diketahui saat tiba di IGD</w:t>
+            </w:r>
+          </w:p>
+        </w:tc>
+        <w:tc>
+          <w:tcPr>
+            <w:tcW w:type="dxa" w:w="1690"/>
+          </w:tcPr>
+          <w:p>
+            <w:pPr>
+              <w:pStyle w:val="tablecopy"/>
+              <w:keepNext w:val="0"/>
+              <w:jc w:val="left"/>
+            </w:pPr>
+            <w:r>
+              <w:rPr>
+                <w:sz w:val="14"/>
+              </w:rPr>
+              <w:t>18,9% pasien dengan onset tidak diketahui [5]</w:t>
+            </w:r>
+          </w:p>
+        </w:tc>
+        <w:tc>
+          <w:tcPr>
+            <w:tcW w:type="dxa" w:w="1573"/>
+          </w:tcPr>
+          <w:p>
+            <w:pPr>
+              <w:pStyle w:val="tablecopy"/>
+              <w:keepNext w:val="0"/>
+              <w:jc w:val="left"/>
+            </w:pPr>
+            <w:r>
+              <w:rPr>
+                <w:sz w:val="14"/>
+              </w:rPr>
+              <w:t>Tercatat di 100% eskalasi merah</w:t>
             </w:r>
           </w:p>
         </w:tc>
@@ -4945,7 +4984,684 @@
         </w:trPr>
         <w:tc>
           <w:tcPr>
-            <w:tcW w:type="dxa" w:w="1107"/>
+            <w:tcW w:type="dxa" w:w="1573"/>
+          </w:tcPr>
+          <w:p>
+            <w:pPr>
+              <w:pStyle w:val="tablecopy"/>
+              <w:keepNext w:val="0"/>
+              <w:jc w:val="left"/>
+            </w:pPr>
+            <w:r>
+              <w:rPr>
+                <w:b/>
+                <w:sz w:val="14"/>
+              </w:rPr>
+              <w:t>Penderita hipertensi tidak rutin minum obat</w:t>
+            </w:r>
+          </w:p>
+        </w:tc>
+        <w:tc>
+          <w:tcPr>
+            <w:tcW w:type="dxa" w:w="1690"/>
+          </w:tcPr>
+          <w:p>
+            <w:pPr>
+              <w:pStyle w:val="tablecopy"/>
+              <w:keepNext w:val="0"/>
+              <w:jc w:val="left"/>
+            </w:pPr>
+            <w:r>
+              <w:rPr>
+                <w:sz w:val="14"/>
+              </w:rPr>
+              <w:t>32,3% [8]</w:t>
+            </w:r>
+          </w:p>
+        </w:tc>
+        <w:tc>
+          <w:tcPr>
+            <w:tcW w:type="dxa" w:w="1573"/>
+          </w:tcPr>
+          <w:p>
+            <w:pPr>
+              <w:pStyle w:val="tablecopy"/>
+              <w:keepNext w:val="0"/>
+              <w:jc w:val="left"/>
+            </w:pPr>
+            <w:r>
+              <w:rPr>
+                <w:sz w:val="14"/>
+              </w:rPr>
+              <w:t>&lt; 15% menurut rapor 30 hari</w:t>
+            </w:r>
+          </w:p>
+        </w:tc>
+      </w:tr>
+      <w:tr>
+        <w:trPr>
+          <w:cantSplit/>
+        </w:trPr>
+        <w:tc>
+          <w:tcPr>
+            <w:tcW w:type="dxa" w:w="1573"/>
+          </w:tcPr>
+          <w:p>
+            <w:pPr>
+              <w:pStyle w:val="tablecopy"/>
+              <w:keepNext w:val="0"/>
+              <w:jc w:val="left"/>
+            </w:pPr>
+            <w:r>
+              <w:rPr>
+                <w:b/>
+                <w:sz w:val="14"/>
+              </w:rPr>
+              <w:t>Rasio Peserta Prolanis Terkendali (RPPT)</w:t>
+            </w:r>
+          </w:p>
+        </w:tc>
+        <w:tc>
+          <w:tcPr>
+            <w:tcW w:type="dxa" w:w="1690"/>
+          </w:tcPr>
+          <w:p>
+            <w:pPr>
+              <w:pStyle w:val="tablecopy"/>
+              <w:keepNext w:val="0"/>
+              <w:jc w:val="left"/>
+            </w:pPr>
+            <w:r>
+              <w:rPr>
+                <w:sz w:val="14"/>
+              </w:rPr>
+              <w:t>0,68% di Cilegon, target nasional 5% [11]</w:t>
+            </w:r>
+          </w:p>
+        </w:tc>
+        <w:tc>
+          <w:tcPr>
+            <w:tcW w:type="dxa" w:w="1573"/>
+          </w:tcPr>
+          <w:p>
+            <w:pPr>
+              <w:pStyle w:val="tablecopy"/>
+              <w:keepNext w:val="0"/>
+              <w:jc w:val="left"/>
+            </w:pPr>
+            <w:r>
+              <w:rPr>
+                <w:sz w:val="14"/>
+              </w:rPr>
+              <w:t>≥ 5% di Puskesmas pilot</w:t>
+            </w:r>
+          </w:p>
+        </w:tc>
+      </w:tr>
+      <w:tr>
+        <w:trPr>
+          <w:cantSplit/>
+        </w:trPr>
+        <w:tc>
+          <w:tcPr>
+            <w:tcW w:type="dxa" w:w="1573"/>
+          </w:tcPr>
+          <w:p>
+            <w:pPr>
+              <w:pStyle w:val="tablecopy"/>
+              <w:keepNext w:val="0"/>
+              <w:jc w:val="left"/>
+            </w:pPr>
+            <w:r>
+              <w:rPr>
+                <w:b/>
+                <w:sz w:val="14"/>
+              </w:rPr>
+              <w:t>Frekuensi telepon anak ke lansia</w:t>
+            </w:r>
+          </w:p>
+        </w:tc>
+        <w:tc>
+          <w:tcPr>
+            <w:tcW w:type="dxa" w:w="1690"/>
+          </w:tcPr>
+          <w:p>
+            <w:pPr>
+              <w:pStyle w:val="tablecopy"/>
+              <w:keepNext w:val="0"/>
+              <w:jc w:val="left"/>
+            </w:pPr>
+            <w:r>
+              <w:rPr>
+                <w:sz w:val="14"/>
+              </w:rPr>
+              <w:t>Diukur di bulan pertama</w:t>
+            </w:r>
+          </w:p>
+        </w:tc>
+        <w:tc>
+          <w:tcPr>
+            <w:tcW w:type="dxa" w:w="1573"/>
+          </w:tcPr>
+          <w:p>
+            <w:pPr>
+              <w:pStyle w:val="tablecopy"/>
+              <w:keepNext w:val="0"/>
+              <w:jc w:val="left"/>
+            </w:pPr>
+            <w:r>
+              <w:rPr>
+                <w:sz w:val="14"/>
+              </w:rPr>
+              <w:t>Tidak turun (north-star)</w:t>
+            </w:r>
+          </w:p>
+        </w:tc>
+      </w:tr>
+    </w:tbl>
+    <w:p>
+      <w:pPr>
+        <w:spacing w:after="80" w:line="120" w:lineRule="exact"/>
+      </w:pPr>
+    </w:p>
+    <w:p>
+      <w:pPr>
+        <w:pStyle w:val="BodyText"/>
+      </w:pPr>
+      <w:r>
+        <w:t xml:space="preserve">Meski begitu, kami berhati-hati dengan klaim klinis. Di Busan, pre-notifikasi pra-rumah sakit berkaitan dengan door-to-needle yang lebih singkat [18], tetapi meta-analisis belum menemukan efek tunggalnya signifikan [23]. Karena itu keberhasilan KRING diukur dari </w:t>
+      </w:r>
+      <w:r>
+        <w:rPr>
+          <w:i/>
+        </w:rPr>
+        <w:t>onset-to-arrival time</w:t>
+      </w:r>
+      <w:r>
+        <w:t>, bukan dijanjikan memotong door-to-needle.</w:t>
+      </w:r>
+    </w:p>
+    <w:p>
+      <w:pPr>
+        <w:pStyle w:val="Heading2"/>
+      </w:pPr>
+      <w:r>
+        <w:t>Biaya dan model bisnis</w:t>
+      </w:r>
+    </w:p>
+    <w:p>
+      <w:pPr>
+        <w:pStyle w:val="BodyText"/>
+      </w:pPr>
+      <w:r>
+        <w:t xml:space="preserve">Biaya dihitung dari satu panggilan pagi yang diukur di E2: durasi 75 detik, 1.029 karakter suara KRING, dan 659 token LLM. Dengan harga publik gpt</w:t>
+        <w:noBreakHyphen/>
+        <w:t xml:space="preserve">6</w:t>
+        <w:noBreakHyphen/>
+        <w:t xml:space="preserve">luna [24], ElevenLabs Flash dan Scribe [25], serta Twilio US$0,111 per menit ke ponsel Indonesia [26], satu panggilan menghabiskan US$0,27 atau sekitar Rp4.870 pada kurs JISDOR Rp17.948 [27]. Komponen AI (TTS, STT, dan LLM) hanya Rp886; sisanya, 82%, adalah tarif telepon karena Twilio menagih per menit penuh. Jalur telepon lokal jauh lebih murah: tarif telepon rumah ke seluler dalam satu wilayah Rp669 per menit dengan pulsa 30 detik [28], sehingga panggilan 75 detik cukup Rp1.004.</w:t>
+      </w:r>
+    </w:p>
+    <w:p>
+      <w:pPr>
+        <w:pStyle w:val="BodyText"/>
+      </w:pPr>
+      <w:r>
+        <w:t>Tabel IX menunjukkan bahwa KRING tidak mungkin dibiayai dari kapitasi, karena kapitasi itu sendiri harus menanggung seluruh layanan Puskesmas. Model bisnisnya kami susun dari angka ini (Tabel X). Keluarga yang ingin orang tuanya ditelepon setiap hari berlangganan Rp69.000 per bulan, di atas biaya skenario B. Lansia tanpa keluarga pembayar tetap dilayani lewat anggaran program Dinas Kesehatan dengan skenario C, dan otomatis pindah ke panggilan harian begitu statusnya kuning. Untuk pilot 200 pasien, skenario C berarti sekitar Rp59 juta per tahun. Biaya ini masih bisa turun, karena hampir semua kalimat KRING berasal dari skrip sehingga audionya cukup dibuat sekali lalu diputar ulang.</w:t>
+      </w:r>
+    </w:p>
+    <w:p>
+      <w:pPr>
+        <w:pStyle w:val="tablehead"/>
+        <w:keepNext/>
+        <w:spacing w:before="160" w:after="80"/>
+      </w:pPr>
+      <w:r>
+        <w:t>Biaya per pasien per bulan dibandingkan kapitasi</w:t>
+      </w:r>
+    </w:p>
+    <w:tbl>
+      <w:tblPr>
+        <w:tblW w:type="auto" w:w="0"/>
+        <w:jc w:val="center"/>
+        <w:tblLayout w:type="fixed"/>
+        <w:tblLook w:firstColumn="1" w:firstRow="1" w:lastColumn="0" w:lastRow="0" w:noHBand="0" w:noVBand="1" w:val="04A0"/>
+        <w:tblBorders>
+          <w:top w:val="single" w:sz="8" w:color="000000"/>
+          <w:left w:val="nil"/>
+          <w:bottom w:val="single" w:sz="8" w:color="000000"/>
+          <w:right w:val="nil"/>
+          <w:insideH w:val="nil"/>
+          <w:insideV w:val="nil"/>
+        </w:tblBorders>
+        <w:tblLayout w:type="fixed"/>
+        <w:tblCellMar>
+          <w:top w:w="20" w:type="dxa"/>
+          <w:bottom w:w="20" w:type="dxa"/>
+          <w:left w:w="60" w:type="dxa"/>
+          <w:right w:w="60" w:type="dxa"/>
+        </w:tblCellMar>
+      </w:tblPr>
+      <w:tblGrid>
+        <w:gridCol w:w="2622"/>
+        <w:gridCol w:w="932"/>
+        <w:gridCol w:w="1282"/>
+      </w:tblGrid>
+      <w:tr>
+        <w:trPr>
+          <w:tblHeader w:val="true"/>
+          <w:cantSplit/>
+        </w:trPr>
+        <w:tc>
+          <w:tcPr>
+            <w:tcW w:type="dxa" w:w="2622"/>
+            <w:tcBorders>
+              <w:bottom w:val="single" w:sz="4" w:color="000000"/>
+            </w:tcBorders>
+          </w:tcPr>
+          <w:p>
+            <w:pPr>
+              <w:pStyle w:val="tablecolhead"/>
+              <w:keepNext/>
+            </w:pPr>
+            <w:r>
+              <w:rPr>
+                <w:sz w:val="14"/>
+              </w:rPr>
+              <w:t>Skenario</w:t>
+            </w:r>
+          </w:p>
+        </w:tc>
+        <w:tc>
+          <w:tcPr>
+            <w:tcW w:type="dxa" w:w="932"/>
+            <w:tcBorders>
+              <w:bottom w:val="single" w:sz="4" w:color="000000"/>
+            </w:tcBorders>
+          </w:tcPr>
+          <w:p>
+            <w:pPr>
+              <w:pStyle w:val="tablecolhead"/>
+              <w:keepNext/>
+            </w:pPr>
+            <w:r>
+              <w:rPr>
+                <w:sz w:val="14"/>
+              </w:rPr>
+              <w:t>Per panggilan</w:t>
+            </w:r>
+          </w:p>
+        </w:tc>
+        <w:tc>
+          <w:tcPr>
+            <w:tcW w:type="dxa" w:w="1282"/>
+            <w:tcBorders>
+              <w:bottom w:val="single" w:sz="4" w:color="000000"/>
+            </w:tcBorders>
+          </w:tcPr>
+          <w:p>
+            <w:pPr>
+              <w:pStyle w:val="tablecolhead"/>
+              <w:keepNext/>
+            </w:pPr>
+            <w:r>
+              <w:rPr>
+                <w:sz w:val="14"/>
+              </w:rPr>
+              <w:t>Per pasien per bulan</w:t>
+            </w:r>
+          </w:p>
+        </w:tc>
+      </w:tr>
+      <w:tr>
+        <w:trPr>
+          <w:cantSplit/>
+        </w:trPr>
+        <w:tc>
+          <w:tcPr>
+            <w:tcW w:type="dxa" w:w="2622"/>
+          </w:tcPr>
+          <w:p>
+            <w:pPr>
+              <w:pStyle w:val="tablecopy"/>
+              <w:keepNext w:val="0"/>
+              <w:jc w:val="left"/>
+            </w:pPr>
+            <w:r>
+              <w:rPr>
+                <w:b/>
+                <w:sz w:val="14"/>
+              </w:rPr>
+              <w:t>A. Twilio, setiap hari (prototipe)</w:t>
+            </w:r>
+          </w:p>
+        </w:tc>
+        <w:tc>
+          <w:tcPr>
+            <w:tcW w:type="dxa" w:w="932"/>
+          </w:tcPr>
+          <w:p>
+            <w:pPr>
+              <w:pStyle w:val="tablecopy"/>
+              <w:keepNext w:val="0"/>
+              <w:jc w:val="left"/>
+            </w:pPr>
+            <w:r>
+              <w:rPr>
+                <w:sz w:val="14"/>
+              </w:rPr>
+              <w:t>Rp4.870</w:t>
+            </w:r>
+          </w:p>
+        </w:tc>
+        <w:tc>
+          <w:tcPr>
+            <w:tcW w:type="dxa" w:w="1282"/>
+          </w:tcPr>
+          <w:p>
+            <w:pPr>
+              <w:pStyle w:val="tablecopy"/>
+              <w:keepNext w:val="0"/>
+              <w:jc w:val="left"/>
+            </w:pPr>
+            <w:r>
+              <w:rPr>
+                <w:sz w:val="14"/>
+              </w:rPr>
+              <w:t>Rp146.100</w:t>
+            </w:r>
+          </w:p>
+        </w:tc>
+      </w:tr>
+      <w:tr>
+        <w:trPr>
+          <w:cantSplit/>
+        </w:trPr>
+        <w:tc>
+          <w:tcPr>
+            <w:tcW w:type="dxa" w:w="2622"/>
+          </w:tcPr>
+          <w:p>
+            <w:pPr>
+              <w:pStyle w:val="tablecopy"/>
+              <w:keepNext w:val="0"/>
+              <w:jc w:val="left"/>
+            </w:pPr>
+            <w:r>
+              <w:rPr>
+                <w:b/>
+                <w:sz w:val="14"/>
+              </w:rPr>
+              <w:t>B. Jalur telepon lokal, setiap hari</w:t>
+            </w:r>
+          </w:p>
+        </w:tc>
+        <w:tc>
+          <w:tcPr>
+            <w:tcW w:type="dxa" w:w="932"/>
+          </w:tcPr>
+          <w:p>
+            <w:pPr>
+              <w:pStyle w:val="tablecopy"/>
+              <w:keepNext w:val="0"/>
+              <w:jc w:val="left"/>
+            </w:pPr>
+            <w:r>
+              <w:rPr>
+                <w:sz w:val="14"/>
+              </w:rPr>
+              <w:t>Rp1.890</w:t>
+            </w:r>
+          </w:p>
+        </w:tc>
+        <w:tc>
+          <w:tcPr>
+            <w:tcW w:type="dxa" w:w="1282"/>
+          </w:tcPr>
+          <w:p>
+            <w:pPr>
+              <w:pStyle w:val="tablecopy"/>
+              <w:keepNext w:val="0"/>
+              <w:jc w:val="left"/>
+            </w:pPr>
+            <w:r>
+              <w:rPr>
+                <w:sz w:val="14"/>
+              </w:rPr>
+              <w:t>Rp56.700</w:t>
+            </w:r>
+          </w:p>
+        </w:tc>
+      </w:tr>
+      <w:tr>
+        <w:trPr>
+          <w:cantSplit/>
+        </w:trPr>
+        <w:tc>
+          <w:tcPr>
+            <w:tcW w:type="dxa" w:w="2622"/>
+          </w:tcPr>
+          <w:p>
+            <w:pPr>
+              <w:pStyle w:val="tablecopy"/>
+              <w:keepNext w:val="0"/>
+              <w:jc w:val="left"/>
+            </w:pPr>
+            <w:r>
+              <w:rPr>
+                <w:b/>
+                <w:sz w:val="14"/>
+              </w:rPr>
+              <w:t>C. Jalur lokal, 3 kali seminggu untuk pasien yang 30 hari hijau</w:t>
+            </w:r>
+          </w:p>
+        </w:tc>
+        <w:tc>
+          <w:tcPr>
+            <w:tcW w:type="dxa" w:w="932"/>
+          </w:tcPr>
+          <w:p>
+            <w:pPr>
+              <w:pStyle w:val="tablecopy"/>
+              <w:keepNext w:val="0"/>
+              <w:jc w:val="left"/>
+            </w:pPr>
+            <w:r>
+              <w:rPr>
+                <w:sz w:val="14"/>
+              </w:rPr>
+              <w:t>Rp1.890</w:t>
+            </w:r>
+          </w:p>
+        </w:tc>
+        <w:tc>
+          <w:tcPr>
+            <w:tcW w:type="dxa" w:w="1282"/>
+          </w:tcPr>
+          <w:p>
+            <w:pPr>
+              <w:pStyle w:val="tablecopy"/>
+              <w:keepNext w:val="0"/>
+              <w:jc w:val="left"/>
+            </w:pPr>
+            <w:r>
+              <w:rPr>
+                <w:sz w:val="14"/>
+              </w:rPr>
+              <w:t>Rp24.600</w:t>
+            </w:r>
+          </w:p>
+        </w:tc>
+      </w:tr>
+      <w:tr>
+        <w:trPr>
+          <w:cantSplit/>
+        </w:trPr>
+        <w:tc>
+          <w:tcPr>
+            <w:tcW w:type="dxa" w:w="2622"/>
+          </w:tcPr>
+          <w:p>
+            <w:pPr>
+              <w:pStyle w:val="tablecopy"/>
+              <w:keepNext w:val="0"/>
+              <w:jc w:val="left"/>
+            </w:pPr>
+            <w:r>
+              <w:rPr>
+                <w:b/>
+                <w:sz w:val="14"/>
+              </w:rPr>
+              <w:t>Pembanding: seluruh kapitasi Puskesmas untuk satu peserta JKN [29]</w:t>
+            </w:r>
+          </w:p>
+        </w:tc>
+        <w:tc>
+          <w:tcPr>
+            <w:tcW w:type="dxa" w:w="932"/>
+          </w:tcPr>
+          <w:p>
+            <w:pPr>
+              <w:pStyle w:val="tablecopy"/>
+              <w:keepNext w:val="0"/>
+              <w:jc w:val="left"/>
+            </w:pPr>
+          </w:p>
+        </w:tc>
+        <w:tc>
+          <w:tcPr>
+            <w:tcW w:type="dxa" w:w="1282"/>
+          </w:tcPr>
+          <w:p>
+            <w:pPr>
+              <w:pStyle w:val="tablecopy"/>
+              <w:keepNext w:val="0"/>
+              <w:jc w:val="left"/>
+            </w:pPr>
+            <w:r>
+              <w:rPr>
+                <w:sz w:val="14"/>
+              </w:rPr>
+              <w:t>Rp3.600 sampai Rp9.000</w:t>
+            </w:r>
+          </w:p>
+        </w:tc>
+      </w:tr>
+    </w:tbl>
+    <w:p>
+      <w:pPr>
+        <w:spacing w:after="80" w:line="120" w:lineRule="exact"/>
+      </w:pPr>
+    </w:p>
+    <w:p>
+      <w:pPr>
+        <w:pStyle w:val="tablehead"/>
+        <w:keepNext/>
+        <w:spacing w:before="160" w:after="80"/>
+      </w:pPr>
+      <w:r>
+        <w:t>Tiga jalur pembayar</w:t>
+      </w:r>
+    </w:p>
+    <w:tbl>
+      <w:tblPr>
+        <w:tblW w:type="auto" w:w="0"/>
+        <w:jc w:val="center"/>
+        <w:tblLayout w:type="fixed"/>
+        <w:tblLook w:firstColumn="1" w:firstRow="1" w:lastColumn="0" w:lastRow="0" w:noHBand="0" w:noVBand="1" w:val="04A0"/>
+        <w:tblBorders>
+          <w:top w:val="single" w:sz="8" w:color="000000"/>
+          <w:left w:val="nil"/>
+          <w:bottom w:val="single" w:sz="8" w:color="000000"/>
+          <w:right w:val="nil"/>
+          <w:insideH w:val="nil"/>
+          <w:insideV w:val="nil"/>
+        </w:tblBorders>
+        <w:tblLayout w:type="fixed"/>
+        <w:tblCellMar>
+          <w:top w:w="20" w:type="dxa"/>
+          <w:bottom w:w="20" w:type="dxa"/>
+          <w:left w:w="60" w:type="dxa"/>
+          <w:right w:w="60" w:type="dxa"/>
+        </w:tblCellMar>
+      </w:tblPr>
+      <w:tblGrid>
+        <w:gridCol w:w="1049"/>
+        <w:gridCol w:w="1894"/>
+        <w:gridCol w:w="1894"/>
+      </w:tblGrid>
+      <w:tr>
+        <w:trPr>
+          <w:tblHeader w:val="true"/>
+          <w:cantSplit/>
+        </w:trPr>
+        <w:tc>
+          <w:tcPr>
+            <w:tcW w:type="dxa" w:w="1049"/>
+            <w:tcBorders>
+              <w:bottom w:val="single" w:sz="4" w:color="000000"/>
+            </w:tcBorders>
+          </w:tcPr>
+          <w:p>
+            <w:pPr>
+              <w:pStyle w:val="tablecolhead"/>
+              <w:keepNext/>
+            </w:pPr>
+            <w:r>
+              <w:rPr>
+                <w:sz w:val="15"/>
+              </w:rPr>
+              <w:t>Pembayar</w:t>
+            </w:r>
+          </w:p>
+        </w:tc>
+        <w:tc>
+          <w:tcPr>
+            <w:tcW w:type="dxa" w:w="1894"/>
+            <w:tcBorders>
+              <w:bottom w:val="single" w:sz="4" w:color="000000"/>
+            </w:tcBorders>
+          </w:tcPr>
+          <w:p>
+            <w:pPr>
+              <w:pStyle w:val="tablecolhead"/>
+              <w:keepNext/>
+            </w:pPr>
+            <w:r>
+              <w:rPr>
+                <w:sz w:val="15"/>
+              </w:rPr>
+              <w:t>Nilai yang didapat</w:t>
+            </w:r>
+          </w:p>
+        </w:tc>
+        <w:tc>
+          <w:tcPr>
+            <w:tcW w:type="dxa" w:w="1894"/>
+            <w:tcBorders>
+              <w:bottom w:val="single" w:sz="4" w:color="000000"/>
+            </w:tcBorders>
+          </w:tcPr>
+          <w:p>
+            <w:pPr>
+              <w:pStyle w:val="tablecolhead"/>
+              <w:keepNext/>
+            </w:pPr>
+            <w:r>
+              <w:rPr>
+                <w:sz w:val="15"/>
+              </w:rPr>
+              <w:t>Skema</w:t>
+            </w:r>
+          </w:p>
+        </w:tc>
+      </w:tr>
+      <w:tr>
+        <w:trPr>
+          <w:cantSplit/>
+        </w:trPr>
+        <w:tc>
+          <w:tcPr>
+            <w:tcW w:type="dxa" w:w="1049"/>
           </w:tcPr>
           <w:p>
             <w:pPr>
@@ -4958,13 +5674,133 @@
                 <w:b/>
                 <w:sz w:val="15"/>
               </w:rPr>
+              <w:t>Keluarga (premium)</w:t>
+            </w:r>
+          </w:p>
+        </w:tc>
+        <w:tc>
+          <w:tcPr>
+            <w:tcW w:type="dxa" w:w="1894"/>
+          </w:tcPr>
+          <w:p>
+            <w:pPr>
+              <w:pStyle w:val="tablecopy"/>
+              <w:keepNext w:val="0"/>
+              <w:jc w:val="left"/>
+            </w:pPr>
+            <w:r>
+              <w:rPr>
+                <w:sz w:val="15"/>
+              </w:rPr>
+              <w:t>Telepon harian, rapor 30 hari, sinkron jam tangan, menu rendah garam</w:t>
+            </w:r>
+          </w:p>
+        </w:tc>
+        <w:tc>
+          <w:tcPr>
+            <w:tcW w:type="dxa" w:w="1894"/>
+          </w:tcPr>
+          <w:p>
+            <w:pPr>
+              <w:pStyle w:val="tablecopy"/>
+              <w:keepNext w:val="0"/>
+              <w:jc w:val="left"/>
+            </w:pPr>
+            <w:r>
+              <w:rPr>
+                <w:sz w:val="15"/>
+              </w:rPr>
+              <w:t>Rp69.000 per bulan; selisih di atas biaya menyubsidi jalur gratis</w:t>
+            </w:r>
+          </w:p>
+        </w:tc>
+      </w:tr>
+      <w:tr>
+        <w:trPr>
+          <w:cantSplit/>
+        </w:trPr>
+        <w:tc>
+          <w:tcPr>
+            <w:tcW w:type="dxa" w:w="1049"/>
+          </w:tcPr>
+          <w:p>
+            <w:pPr>
+              <w:pStyle w:val="tablecopy"/>
+              <w:keepNext w:val="0"/>
+              <w:jc w:val="left"/>
+            </w:pPr>
+            <w:r>
+              <w:rPr>
+                <w:b/>
+                <w:sz w:val="15"/>
+              </w:rPr>
+              <w:t>Dinas Kesehatan (B2G)</w:t>
+            </w:r>
+          </w:p>
+        </w:tc>
+        <w:tc>
+          <w:tcPr>
+            <w:tcW w:type="dxa" w:w="1894"/>
+          </w:tcPr>
+          <w:p>
+            <w:pPr>
+              <w:pStyle w:val="tablecopy"/>
+              <w:keepNext w:val="0"/>
+              <w:jc w:val="left"/>
+            </w:pPr>
+            <w:r>
+              <w:rPr>
+                <w:sz w:val="15"/>
+              </w:rPr>
+              <w:t>Data tensi dan kepatuhan untuk RPPT; beban telepon manual berkurang</w:t>
+            </w:r>
+          </w:p>
+        </w:tc>
+        <w:tc>
+          <w:tcPr>
+            <w:tcW w:type="dxa" w:w="1894"/>
+          </w:tcPr>
+          <w:p>
+            <w:pPr>
+              <w:pStyle w:val="tablecopy"/>
+              <w:keepNext w:val="0"/>
+              <w:jc w:val="left"/>
+            </w:pPr>
+            <w:r>
+              <w:rPr>
+                <w:sz w:val="15"/>
+              </w:rPr>
+              <w:t>Kontrak per pasien berisiko dari anggaran program (BOK/APBD), bukan kapitasi; gratis bagi pasien</w:t>
+            </w:r>
+          </w:p>
+        </w:tc>
+      </w:tr>
+      <w:tr>
+        <w:trPr>
+          <w:cantSplit/>
+        </w:trPr>
+        <w:tc>
+          <w:tcPr>
+            <w:tcW w:type="dxa" w:w="1049"/>
+          </w:tcPr>
+          <w:p>
+            <w:pPr>
+              <w:pStyle w:val="tablecopy"/>
+              <w:keepNext w:val="0"/>
+              <w:jc w:val="left"/>
+            </w:pPr>
+            <w:r>
+              <w:rPr>
+                <w:b/>
+                <w:sz w:val="15"/>
+              </w:rPr>
               <w:t>Asuransi / mitra RS</w:t>
             </w:r>
           </w:p>
         </w:tc>
         <w:tc>
           <w:tcPr>
-            <w:tcW w:type="dxa" w:w="1865"/>
+            <w:tcW w:type="dxa" w:w="1894"/>
           </w:tcPr>
           <w:p>
             <w:pPr>
@@ -4976,13 +5812,13 @@
               <w:rPr>
                 <w:sz w:val="15"/>
               </w:rPr>
-              <w:t>Deteksi dini, potensi klaim stroke berat berkurang</w:t>
-            </w:r>
-          </w:p>
-        </w:tc>
-        <w:tc>
-          <w:tcPr>
-            <w:tcW w:type="dxa" w:w="1865"/>
+              <w:t>Deteksi dini; klaim stroke JKN 2024 mencapai Rp5,8 triliun [30]</w:t>
+            </w:r>
+          </w:p>
+        </w:tc>
+        <w:tc>
+          <w:tcPr>
+            <w:tcW w:type="dxa" w:w="1894"/>
           </w:tcPr>
           <w:p>
             <w:pPr>
@@ -5007,35 +5843,18 @@
     </w:p>
     <w:p>
       <w:pPr>
+        <w:pStyle w:val="Heading2"/>
+      </w:pPr>
+      <w:r>
+        <w:t>Roadmap</w:t>
+      </w:r>
+    </w:p>
+    <w:p>
+      <w:pPr>
         <w:pStyle w:val="BodyText"/>
       </w:pPr>
       <w:r>
-        <w:t xml:space="preserve">Biaya dihitung dari pemakaian satu panggilan pagi yang diukur di E2: durasi 75 detik, 1.029 karakter suara KRING, dan 659 token LLM. Dengan harga publik saat ini, yaitu gpt-6-luna US$0,10/0,50 per juta token masuk/keluar [24], ElevenLabs Flash US$0,04 per 1.000 karakter dan Scribe Realtime US$0,39 per jam [25], serta Twilio US$0,1066 per menit ke ponsel Indonesia ditambah Media Streams US$0,0044 per menit [26], biaya 100 panggilan sekitar </w:t>
-      </w:r>
-      <w:r>
-        <w:rPr>
-          <w:b/>
-        </w:rPr>
-        <w:t>US$27,1</w:t>
-      </w:r>
-      <w:r>
-        <w:t>. Rinciannya: telepon US$22,2 (dibulatkan dua menit per panggilan), TTS US$4,1, STT US$0,8, dan LLM sekitar US$0,01. Lebih dari 80% biaya adalah tarif telepon, sehingga kerja sama dengan operator atau nomor lokal menjadi cara paling efektif untuk menekan biaya.</w:t>
-      </w:r>
-    </w:p>
-    <w:p>
-      <w:pPr>
-        <w:pStyle w:val="Heading2"/>
-      </w:pPr>
-      <w:r>
-        <w:t>Roadmap</w:t>
-      </w:r>
-    </w:p>
-    <w:p>
-      <w:pPr>
-        <w:pStyle w:val="BodyText"/>
-      </w:pPr>
-      <w:r>
-        <w:t>Gambar 7 menunjukkan lima fase pengembangan KRING. Fase 1 dan 2, yaitu riset dan prototipe, sudah selesai. Fase 3 sampai 5 kami jalankan bersama mitra: tenaga kesehatan, lansia dan keluarganya, serta jejaring rumah sakit. Langkah berikutnya adalah menyambungkan panggilan telepon sungguhan, meminta tenaga kesehatan meninjau aturan klinis, menguji kegunaan bersama 5-10 lansia dan keluarganya dengan persetujuan tertulis, lalu mengajak jejaring Code Stroke di Gunungkidul untuk pilot dalam kerangka sandbox. Indikator pilotnya adalah onset-to-arrival time, persentase pasien yang tiba dalam golden period, RPPT, dan frekuensi telepon keluarga.</w:t>
+        <w:t>Gambar 7 menunjukkan lima fase pengembangan KRING. Fase 1 dan 2, yaitu riset dan prototipe, sudah selesai. Fase 3 sampai 5 kami jalankan bersama mitra: tenaga kesehatan, lansia dan keluarganya, serta jejaring rumah sakit. Langkah berikutnya adalah menyambungkan panggilan telepon sungguhan, meminta tenaga kesehatan meninjau aturan klinis, menguji kegunaan bersama 5-10 lansia dan keluarganya dengan persetujuan tertulis, lalu mengajak jejaring Code Stroke di Gunungkidul untuk pilot 12 bulan dengan 200 lansia dalam kerangka sandbox, memakai indikator di Tabel VIII.</w:t>
       </w:r>
     </w:p>
     <w:tbl>
@@ -5186,7 +6005,7 @@
         <w:jc w:val="left"/>
       </w:pPr>
       <w:r>
-        <w:t>Universitas Muhammadiyah Yogyakarta, "Bab I Pendahuluan" (tugas akhir; mengutip data keterlambatan pasien stroke RSHS Bandung). [Daring]. Tersedia: https://etd.umy.ac.id/46447/4/Bab%20I.pdf</w:t>
+        <w:t>R. Y. Salvador, A. Basuki, dan C. Juli, "Time to hospital admission of stroke patients in Department of Neurology Hasan Sadikin General Hospital Bandung," Journal of Medicine and Health, vol. 2, no. 6, 2020, doi: 10.28932/jmh.v2i6.2431.</w:t>
       </w:r>
     </w:p>
     <w:p>
@@ -5195,7 +6014,7 @@
         <w:jc w:val="left"/>
       </w:pPr>
       <w:r>
-        <w:t>Universitas Muhammadiyah Jember, "Bab I Pendahuluan" (skripsi; mengutip data kedatangan pasien stroke RSOMH Bukittinggi 2024). [Daring]. Tersedia: https://repository.unmuhjember.ac.id/32417/2/C.%20BAB%20I.pdf</w:t>
+        <w:t>N. Yang dan Y. B. Hartanto, "Characteristics and reasons for delayed presentation in acute ischemic stroke: single-centered study in Indonesia," The Egyptian Journal of Neurology, Psychiatry and Neurosurgery, vol. 60, art. 67, 2024, doi: 10.1186/s41983-024-00838-4.</w:t>
       </w:r>
     </w:p>
     <w:p>
@@ -5204,7 +6023,7 @@
         <w:jc w:val="left"/>
       </w:pPr>
       <w:r>
-        <w:t>CNBC Indonesia, "Indonesia Masuk Fase Aging Population, Yogyakarta yang Tertinggi" (rilis BPS, SUPAS 2025), 5 Mei 2026. [Daring]. Tersedia: https://www.cnbcindonesia.com/news/20260505124043-4-732367/indonesia-masuk-fase-aging-population-yogyakarta-yang-tertinggi</w:t>
+        <w:t>Badan Pusat Statistik, "SUPAS 2025: Angka Kelahiran Total (TFR) sebesar 2,13, Angka Kematian Bayi (IMR) sebesar 14,12, dan persentase lansia mencapai 11,97 persen," Berita Resmi Statistik, 5 Mei 2026. [Daring]. Tersedia: https://www.bps.go.id/id/pressrelease/2026/05/05/2645/hasil-survey-penduduk-antar-sensus.html</w:t>
       </w:r>
     </w:p>
     <w:p>
@@ -5231,7 +6050,7 @@
         <w:jc w:val="left"/>
       </w:pPr>
       <w:r>
-        <w:t>GoodStats, "52% Lansia Indonesia Menggunakan HP pada 2025" (data BPS). [Daring]. Tersedia: https://data.goodstats.id/statistic/52-lansia-indonesia-menggunakan-hp-pada-2025-mPzl6</w:t>
+        <w:t>Badan Pusat Statistik, Statistik Penduduk Lanjut Usia 2025. Jakarta: BPS, Des. 2025. [Daring]. Tersedia: https://www.bps.go.id/id/publication/2025/12/12/868d335b088dcddc3ddee052/statistik-penduduk-lanjut-usia-2025.html</w:t>
       </w:r>
     </w:p>
     <w:p>
@@ -5240,7 +6059,7 @@
         <w:jc w:val="left"/>
       </w:pPr>
       <w:r>
-        <w:t>Investortrust, "BPJS Kesehatan Tekan Kasus Kronis dengan Prolanis." [Daring]. Tersedia: https://investortrust.id/lifestyle/82798/bpjs-kesehatan-tekan-kasus-kronis-dengan-prolanis</w:t>
+        <w:t>L. Kresnowati (Direktur Jaminan Pelayanan Kesehatan BPJS Kesehatan), dikutip dalam "Program Prolanis dari BPJS Kesehatan Diharapkan Mampu Tekan Kasus Kronis," detikNews, 21 Okt. 2025. [Daring]. Tersedia: https://news.detik.com/berita/d-8170616/program-prolanis-dari-bpjs-kesehatan-diharapkan-mampu-tekan-kasus-kronis</w:t>
       </w:r>
     </w:p>
     <w:p>
@@ -5348,7 +6167,7 @@
         <w:jc w:val="left"/>
       </w:pPr>
       <w:r>
-        <w:t>SIP Law Firm, "Alat Kesehatan Berbasis Software: Kepmenkes HK.01.07/MENKES/951/2026" (ringkasan regulasi), 2026. [Daring]. Tersedia: https://siplawfirm.id/resources/alat-kesehatan-berbasis-software-kepmenkes-951-2026</w:t>
+        <w:t>Kementerian Kesehatan RI, Keputusan Menteri Kesehatan Nomor HK.01.07/MENKES/951/2026 tentang Pedoman Izin Edar Alat Kesehatan Berbasis Perangkat Lunak, ditetapkan 7 Sep. 2026.</w:t>
       </w:r>
     </w:p>
     <w:p>
@@ -5385,6 +6204,42 @@
       </w:pPr>
       <w:r>
         <w:t>Twilio, "Voice Pricing: Indonesia." [Daring]. Tersedia: https://www.twilio.com/en-us/voice/pricing/id (diakses 16 Okt. 2026)</w:t>
+      </w:r>
+    </w:p>
+    <w:p>
+      <w:pPr>
+        <w:pStyle w:val="references"/>
+        <w:jc w:val="left"/>
+      </w:pPr>
+      <w:r>
+        <w:t>Bank Indonesia, "Jakarta Interbank Spot Dollar Rate (JISDOR)," kurs 15 Okt. 2026. [Daring]. Tersedia: https://www.bi.go.id/id/statistik/informasi-kurs/jisdor/default.aspx</w:t>
+      </w:r>
+    </w:p>
+    <w:p>
+      <w:pPr>
+        <w:pStyle w:val="references"/>
+        <w:jc w:val="left"/>
+      </w:pPr>
+      <w:r>
+        <w:t>Telkomsel, "IndiHome Telepon: tarif panggilan ke seluler." [Daring]. Tersedia: https://www.telkomsel.com/indihome/telepon (diakses 16 Okt. 2026)</w:t>
+      </w:r>
+    </w:p>
+    <w:p>
+      <w:pPr>
+        <w:pStyle w:val="references"/>
+        <w:jc w:val="left"/>
+      </w:pPr>
+      <w:r>
+        <w:t>Kementerian Kesehatan RI, Peraturan Menteri Kesehatan Nomor 3 Tahun 2023 tentang Standar Tarif Pelayanan Kesehatan dalam Penyelenggaraan Program Jaminan Kesehatan, 2023.</w:t>
+      </w:r>
+    </w:p>
+    <w:p>
+      <w:pPr>
+        <w:pStyle w:val="references"/>
+        <w:jc w:val="left"/>
+      </w:pPr>
+      <w:r>
+        <w:t>"8 Penyakit Ini jadi Beban BPJS Kesehatan dengan Biaya Tertinggi Sepanjang 2024" (data paparan publik BPJS Kesehatan), Kompas.com, 24 Agu. 2025. [Daring]. Tersedia: https://money.kompas.com/read/2025/08/24/170910126/8-penyakit-ini-jadi-beban-bpjs-kesehatan-dengan-biaya-tertinggi-sepanjang-2024</w:t>
       </w:r>
     </w:p>
     <w:sectPr>

</xml_diff>